<commit_message>
Knowledge - 5/19/2026 part 11
</commit_message>
<xml_diff>
--- a/Knowledge/3-Work knowledge/1-Software Engineering/4-Web Development/2-Frontend/2-Core Technologies/1-HTML/5-My Source/3-HTML Body Elements/13-HTML Graphics Elements.docx
+++ b/Knowledge/3-Work knowledge/1-Software Engineering/4-Web Development/2-Frontend/2-Core Technologies/1-HTML/5-My Source/3-HTML Body Elements/13-HTML Graphics Elements.docx
@@ -971,89 +971,40 @@
           <w:rFonts w:ascii="Roboto Mono" w:hAnsi="Roboto Mono"/>
         </w:rPr>
         <w:br/>
-        <w:t xml:space="preserve">let c = </w:t>
-      </w:r>
-      <w:proofErr w:type="gramStart"/>
-      <w:r>
-        <w:rPr>
-          <w:rFonts w:ascii="Roboto Mono" w:hAnsi="Roboto Mono"/>
-        </w:rPr>
-        <w:t>document.getElementById</w:t>
-      </w:r>
-      <w:proofErr w:type="gramEnd"/>
-      <w:r>
-        <w:rPr>
-          <w:rFonts w:ascii="Roboto Mono" w:hAnsi="Roboto Mono"/>
-        </w:rPr>
-        <w:t>("myCanvas");</w:t>
-      </w:r>
-      <w:r>
-        <w:rPr>
-          <w:rFonts w:ascii="Roboto Mono" w:hAnsi="Roboto Mono"/>
-        </w:rPr>
-        <w:br/>
-        <w:t xml:space="preserve">let ctx = </w:t>
-      </w:r>
-      <w:proofErr w:type="gramStart"/>
-      <w:r>
-        <w:rPr>
-          <w:rFonts w:ascii="Roboto Mono" w:hAnsi="Roboto Mono"/>
-        </w:rPr>
-        <w:t>c.getContext</w:t>
-      </w:r>
-      <w:proofErr w:type="gramEnd"/>
-      <w:r>
-        <w:rPr>
-          <w:rFonts w:ascii="Roboto Mono" w:hAnsi="Roboto Mono"/>
-        </w:rPr>
-        <w:t>("2d");</w:t>
-      </w:r>
-      <w:r>
-        <w:rPr>
-          <w:rFonts w:ascii="Roboto Mono" w:hAnsi="Roboto Mono"/>
-        </w:rPr>
-        <w:br/>
-      </w:r>
-      <w:r>
-        <w:rPr>
-          <w:rFonts w:ascii="Roboto Mono" w:hAnsi="Roboto Mono"/>
-        </w:rPr>
-        <w:br/>
-      </w:r>
-      <w:proofErr w:type="gramStart"/>
+        <w:t>let c = document.getElementById("myCanvas");</w:t>
+      </w:r>
+      <w:r>
+        <w:rPr>
+          <w:rFonts w:ascii="Roboto Mono" w:hAnsi="Roboto Mono"/>
+        </w:rPr>
+        <w:br/>
+        <w:t>let ctx = c.getContext("2d");</w:t>
+      </w:r>
+      <w:r>
+        <w:rPr>
+          <w:rFonts w:ascii="Roboto Mono" w:hAnsi="Roboto Mono"/>
+        </w:rPr>
+        <w:br/>
+      </w:r>
+      <w:r>
+        <w:rPr>
+          <w:rFonts w:ascii="Roboto Mono" w:hAnsi="Roboto Mono"/>
+        </w:rPr>
+        <w:br/>
+      </w:r>
       <w:r>
         <w:rPr>
           <w:rFonts w:ascii="Roboto Mono" w:hAnsi="Roboto Mono"/>
         </w:rPr>
         <w:lastRenderedPageBreak/>
-        <w:t>ctx.fillStyle</w:t>
-      </w:r>
-      <w:proofErr w:type="gramEnd"/>
-      <w:r>
-        <w:rPr>
-          <w:rFonts w:ascii="Roboto Mono" w:hAnsi="Roboto Mono"/>
-        </w:rPr>
-        <w:t xml:space="preserve"> = "blue";</w:t>
-      </w:r>
-      <w:r>
-        <w:rPr>
-          <w:rFonts w:ascii="Roboto Mono" w:hAnsi="Roboto Mono"/>
-        </w:rPr>
-        <w:br/>
-      </w:r>
-      <w:proofErr w:type="gramStart"/>
-      <w:r>
-        <w:rPr>
-          <w:rFonts w:ascii="Roboto Mono" w:hAnsi="Roboto Mono"/>
-        </w:rPr>
-        <w:t>ctx.fillRect</w:t>
-      </w:r>
-      <w:proofErr w:type="gramEnd"/>
-      <w:r>
-        <w:rPr>
-          <w:rFonts w:ascii="Roboto Mono" w:hAnsi="Roboto Mono"/>
-        </w:rPr>
-        <w:t>(20, 20, 150, 50);</w:t>
+        <w:t>ctx.fillStyle = "blue";</w:t>
+      </w:r>
+      <w:r>
+        <w:rPr>
+          <w:rFonts w:ascii="Roboto Mono" w:hAnsi="Roboto Mono"/>
+        </w:rPr>
+        <w:br/>
+        <w:t>ctx.fillRect(20, 20, 150, 50);</w:t>
       </w:r>
       <w:r>
         <w:rPr>
@@ -2376,16 +2327,8 @@
               <w:rPr>
                 <w:rFonts w:ascii="Roboto Mono" w:hAnsi="Roboto Mono"/>
               </w:rPr>
-              <w:t xml:space="preserve">Quality When </w:t>
+              <w:t>Quality When Zooming</w:t>
             </w:r>
-            <w:proofErr w:type="gramStart"/>
-            <w:r>
-              <w:rPr>
-                <w:rFonts w:ascii="Roboto Mono" w:hAnsi="Roboto Mono"/>
-              </w:rPr>
-              <w:t>Zooming</w:t>
-            </w:r>
-            <w:proofErr w:type="gramEnd"/>
           </w:p>
         </w:tc>
         <w:tc>
@@ -5525,21 +5468,7 @@
         <w:rPr>
           <w:rFonts w:ascii="Roboto Mono" w:hAnsi="Roboto Mono"/>
         </w:rPr>
-        <w:t xml:space="preserve">    </w:t>
-      </w:r>
-      <w:proofErr w:type="gramStart"/>
-      <w:r>
-        <w:rPr>
-          <w:rFonts w:ascii="Roboto Mono" w:hAnsi="Roboto Mono"/>
-        </w:rPr>
-        <w:t>&lt;!--</w:t>
-      </w:r>
-      <w:proofErr w:type="gramEnd"/>
-      <w:r>
-        <w:rPr>
-          <w:rFonts w:ascii="Roboto Mono" w:hAnsi="Roboto Mono"/>
-        </w:rPr>
-        <w:t xml:space="preserve"> Canvas --&gt;</w:t>
+        <w:t xml:space="preserve">    &lt;!-- Canvas --&gt;</w:t>
       </w:r>
     </w:p>
     <w:p>
@@ -5665,109 +5594,53 @@
         <w:rPr>
           <w:rFonts w:ascii="Roboto Mono" w:hAnsi="Roboto Mono"/>
         </w:rPr>
-        <w:t xml:space="preserve">        let c = </w:t>
-      </w:r>
-      <w:proofErr w:type="gramStart"/>
-      <w:r>
-        <w:rPr>
-          <w:rFonts w:ascii="Roboto Mono" w:hAnsi="Roboto Mono"/>
-        </w:rPr>
-        <w:t>document.getElementById</w:t>
-      </w:r>
-      <w:proofErr w:type="gramEnd"/>
-      <w:r>
-        <w:rPr>
-          <w:rFonts w:ascii="Roboto Mono" w:hAnsi="Roboto Mono"/>
-        </w:rPr>
-        <w:t>("myCanvas");</w:t>
-      </w:r>
-    </w:p>
-    <w:p>
-      <w:pPr>
-        <w:rPr>
-          <w:rFonts w:ascii="Roboto Mono" w:hAnsi="Roboto Mono"/>
-        </w:rPr>
-      </w:pPr>
-      <w:r>
-        <w:rPr>
-          <w:rFonts w:ascii="Roboto Mono" w:hAnsi="Roboto Mono"/>
-        </w:rPr>
-        <w:t xml:space="preserve">        let ctx = </w:t>
-      </w:r>
-      <w:proofErr w:type="gramStart"/>
-      <w:r>
-        <w:rPr>
-          <w:rFonts w:ascii="Roboto Mono" w:hAnsi="Roboto Mono"/>
-        </w:rPr>
-        <w:t>c.getContext</w:t>
-      </w:r>
-      <w:proofErr w:type="gramEnd"/>
-      <w:r>
-        <w:rPr>
-          <w:rFonts w:ascii="Roboto Mono" w:hAnsi="Roboto Mono"/>
-        </w:rPr>
-        <w:t>("2d");</w:t>
-      </w:r>
-    </w:p>
-    <w:p>
-      <w:pPr>
-        <w:rPr>
-          <w:rFonts w:ascii="Roboto Mono" w:hAnsi="Roboto Mono"/>
-        </w:rPr>
-      </w:pPr>
-    </w:p>
-    <w:p>
-      <w:pPr>
-        <w:rPr>
-          <w:rFonts w:ascii="Roboto Mono" w:hAnsi="Roboto Mono"/>
-        </w:rPr>
-      </w:pPr>
-      <w:r>
-        <w:rPr>
-          <w:rFonts w:ascii="Roboto Mono" w:hAnsi="Roboto Mono"/>
-        </w:rPr>
-        <w:t xml:space="preserve">        </w:t>
-      </w:r>
-      <w:proofErr w:type="gramStart"/>
-      <w:r>
-        <w:rPr>
-          <w:rFonts w:ascii="Roboto Mono" w:hAnsi="Roboto Mono"/>
-        </w:rPr>
-        <w:t>ctx.fillStyle</w:t>
-      </w:r>
-      <w:proofErr w:type="gramEnd"/>
-      <w:r>
-        <w:rPr>
-          <w:rFonts w:ascii="Roboto Mono" w:hAnsi="Roboto Mono"/>
-        </w:rPr>
-        <w:t xml:space="preserve"> = "blue";</w:t>
-      </w:r>
-    </w:p>
-    <w:p>
-      <w:pPr>
-        <w:rPr>
-          <w:rFonts w:ascii="Roboto Mono" w:hAnsi="Roboto Mono"/>
-        </w:rPr>
-      </w:pPr>
-      <w:r>
-        <w:rPr>
-          <w:rFonts w:ascii="Roboto Mono" w:hAnsi="Roboto Mono"/>
-        </w:rPr>
-        <w:t xml:space="preserve">        </w:t>
-      </w:r>
-      <w:proofErr w:type="gramStart"/>
-      <w:r>
-        <w:rPr>
-          <w:rFonts w:ascii="Roboto Mono" w:hAnsi="Roboto Mono"/>
-        </w:rPr>
-        <w:t>ctx.fillRect</w:t>
-      </w:r>
-      <w:proofErr w:type="gramEnd"/>
-      <w:r>
-        <w:rPr>
-          <w:rFonts w:ascii="Roboto Mono" w:hAnsi="Roboto Mono"/>
-        </w:rPr>
-        <w:t>(20, 20, 150, 50);</w:t>
+        <w:t xml:space="preserve">        let c = document.getElementById("myCanvas");</w:t>
+      </w:r>
+    </w:p>
+    <w:p>
+      <w:pPr>
+        <w:rPr>
+          <w:rFonts w:ascii="Roboto Mono" w:hAnsi="Roboto Mono"/>
+        </w:rPr>
+      </w:pPr>
+      <w:r>
+        <w:rPr>
+          <w:rFonts w:ascii="Roboto Mono" w:hAnsi="Roboto Mono"/>
+        </w:rPr>
+        <w:t xml:space="preserve">        let ctx = c.getContext("2d");</w:t>
+      </w:r>
+    </w:p>
+    <w:p>
+      <w:pPr>
+        <w:rPr>
+          <w:rFonts w:ascii="Roboto Mono" w:hAnsi="Roboto Mono"/>
+        </w:rPr>
+      </w:pPr>
+    </w:p>
+    <w:p>
+      <w:pPr>
+        <w:rPr>
+          <w:rFonts w:ascii="Roboto Mono" w:hAnsi="Roboto Mono"/>
+        </w:rPr>
+      </w:pPr>
+      <w:r>
+        <w:rPr>
+          <w:rFonts w:ascii="Roboto Mono" w:hAnsi="Roboto Mono"/>
+        </w:rPr>
+        <w:t xml:space="preserve">        ctx.fillStyle = "blue";</w:t>
+      </w:r>
+    </w:p>
+    <w:p>
+      <w:pPr>
+        <w:rPr>
+          <w:rFonts w:ascii="Roboto Mono" w:hAnsi="Roboto Mono"/>
+        </w:rPr>
+      </w:pPr>
+      <w:r>
+        <w:rPr>
+          <w:rFonts w:ascii="Roboto Mono" w:hAnsi="Roboto Mono"/>
+        </w:rPr>
+        <w:t xml:space="preserve">        ctx.fillRect(20, 20, 150, 50);</w:t>
       </w:r>
     </w:p>
     <w:p>
@@ -5807,21 +5680,7 @@
         <w:rPr>
           <w:rFonts w:ascii="Roboto Mono" w:hAnsi="Roboto Mono"/>
         </w:rPr>
-        <w:t xml:space="preserve">    </w:t>
-      </w:r>
-      <w:proofErr w:type="gramStart"/>
-      <w:r>
-        <w:rPr>
-          <w:rFonts w:ascii="Roboto Mono" w:hAnsi="Roboto Mono"/>
-        </w:rPr>
-        <w:t>&lt;!--</w:t>
-      </w:r>
-      <w:proofErr w:type="gramEnd"/>
-      <w:r>
-        <w:rPr>
-          <w:rFonts w:ascii="Roboto Mono" w:hAnsi="Roboto Mono"/>
-        </w:rPr>
-        <w:t xml:space="preserve"> SVG --&gt;</w:t>
+        <w:t xml:space="preserve">    &lt;!-- SVG --&gt;</w:t>
       </w:r>
     </w:p>
     <w:p>
@@ -6318,21 +6177,7 @@
         <w:rPr>
           <w:rFonts w:ascii="Roboto Mono" w:hAnsi="Roboto Mono"/>
         </w:rPr>
-        <w:t xml:space="preserve">    </w:t>
-      </w:r>
-      <w:proofErr w:type="gramStart"/>
-      <w:r>
-        <w:rPr>
-          <w:rFonts w:ascii="Roboto Mono" w:hAnsi="Roboto Mono"/>
-        </w:rPr>
-        <w:t>&lt;!--</w:t>
-      </w:r>
-      <w:proofErr w:type="gramEnd"/>
-      <w:r>
-        <w:rPr>
-          <w:rFonts w:ascii="Roboto Mono" w:hAnsi="Roboto Mono"/>
-        </w:rPr>
-        <w:t xml:space="preserve"> Canvas --&gt;</w:t>
+        <w:t>    &lt;!-- Canvas --&gt;</w:t>
       </w:r>
     </w:p>
     <w:p>
@@ -6457,48 +6302,20 @@
         <w:rPr>
           <w:rFonts w:ascii="Roboto Mono" w:hAnsi="Roboto Mono"/>
         </w:rPr>
-        <w:t xml:space="preserve">        let c = </w:t>
-      </w:r>
-      <w:proofErr w:type="gramStart"/>
-      <w:r>
-        <w:rPr>
-          <w:rFonts w:ascii="Roboto Mono" w:hAnsi="Roboto Mono"/>
-        </w:rPr>
-        <w:t>document.getElementById</w:t>
-      </w:r>
-      <w:proofErr w:type="gramEnd"/>
-      <w:r>
-        <w:rPr>
-          <w:rFonts w:ascii="Roboto Mono" w:hAnsi="Roboto Mono"/>
-        </w:rPr>
-        <w:t>("myCanvas");</w:t>
-      </w:r>
-    </w:p>
-    <w:p>
-      <w:pPr>
-        <w:rPr>
-          <w:rFonts w:ascii="Roboto Mono" w:hAnsi="Roboto Mono"/>
-        </w:rPr>
-      </w:pPr>
-      <w:r>
-        <w:rPr>
-          <w:rFonts w:ascii="Roboto Mono" w:hAnsi="Roboto Mono"/>
-        </w:rPr>
-        <w:t xml:space="preserve">        let ctx = </w:t>
-      </w:r>
-      <w:proofErr w:type="gramStart"/>
-      <w:r>
-        <w:rPr>
-          <w:rFonts w:ascii="Roboto Mono" w:hAnsi="Roboto Mono"/>
-        </w:rPr>
-        <w:t>c.getContext</w:t>
-      </w:r>
-      <w:proofErr w:type="gramEnd"/>
-      <w:r>
-        <w:rPr>
-          <w:rFonts w:ascii="Roboto Mono" w:hAnsi="Roboto Mono"/>
-        </w:rPr>
-        <w:t>("2d");</w:t>
+        <w:t>        let c = document.getElementById("myCanvas");</w:t>
+      </w:r>
+    </w:p>
+    <w:p>
+      <w:pPr>
+        <w:rPr>
+          <w:rFonts w:ascii="Roboto Mono" w:hAnsi="Roboto Mono"/>
+        </w:rPr>
+      </w:pPr>
+      <w:r>
+        <w:rPr>
+          <w:rFonts w:ascii="Roboto Mono" w:hAnsi="Roboto Mono"/>
+        </w:rPr>
+        <w:t>        let ctx = c.getContext("2d");</w:t>
       </w:r>
     </w:p>
     <w:p>
@@ -6519,48 +6336,20 @@
           <w:rFonts w:ascii="Roboto Mono" w:hAnsi="Roboto Mono"/>
         </w:rPr>
         <w:lastRenderedPageBreak/>
-        <w:t xml:space="preserve">        </w:t>
-      </w:r>
-      <w:proofErr w:type="gramStart"/>
-      <w:r>
-        <w:rPr>
-          <w:rFonts w:ascii="Roboto Mono" w:hAnsi="Roboto Mono"/>
-        </w:rPr>
-        <w:t>ctx.fillStyle</w:t>
-      </w:r>
-      <w:proofErr w:type="gramEnd"/>
-      <w:r>
-        <w:rPr>
-          <w:rFonts w:ascii="Roboto Mono" w:hAnsi="Roboto Mono"/>
-        </w:rPr>
-        <w:t xml:space="preserve"> = "blue";</w:t>
-      </w:r>
-    </w:p>
-    <w:p>
-      <w:pPr>
-        <w:rPr>
-          <w:rFonts w:ascii="Roboto Mono" w:hAnsi="Roboto Mono"/>
-        </w:rPr>
-      </w:pPr>
-      <w:r>
-        <w:rPr>
-          <w:rFonts w:ascii="Roboto Mono" w:hAnsi="Roboto Mono"/>
-        </w:rPr>
-        <w:t xml:space="preserve">        </w:t>
-      </w:r>
-      <w:proofErr w:type="gramStart"/>
-      <w:r>
-        <w:rPr>
-          <w:rFonts w:ascii="Roboto Mono" w:hAnsi="Roboto Mono"/>
-        </w:rPr>
-        <w:t>ctx.fillRect</w:t>
-      </w:r>
-      <w:proofErr w:type="gramEnd"/>
-      <w:r>
-        <w:rPr>
-          <w:rFonts w:ascii="Roboto Mono" w:hAnsi="Roboto Mono"/>
-        </w:rPr>
-        <w:t>(20, 20, 150, 50);</w:t>
+        <w:t>        ctx.fillStyle = "blue";</w:t>
+      </w:r>
+    </w:p>
+    <w:p>
+      <w:pPr>
+        <w:rPr>
+          <w:rFonts w:ascii="Roboto Mono" w:hAnsi="Roboto Mono"/>
+        </w:rPr>
+      </w:pPr>
+      <w:r>
+        <w:rPr>
+          <w:rFonts w:ascii="Roboto Mono" w:hAnsi="Roboto Mono"/>
+        </w:rPr>
+        <w:t>        ctx.fillRect(20, 20, 150, 50);</w:t>
       </w:r>
     </w:p>
     <w:p>
@@ -6600,21 +6389,7 @@
         <w:rPr>
           <w:rFonts w:ascii="Roboto Mono" w:hAnsi="Roboto Mono"/>
         </w:rPr>
-        <w:t xml:space="preserve">    </w:t>
-      </w:r>
-      <w:proofErr w:type="gramStart"/>
-      <w:r>
-        <w:rPr>
-          <w:rFonts w:ascii="Roboto Mono" w:hAnsi="Roboto Mono"/>
-        </w:rPr>
-        <w:t>&lt;!--</w:t>
-      </w:r>
-      <w:proofErr w:type="gramEnd"/>
-      <w:r>
-        <w:rPr>
-          <w:rFonts w:ascii="Roboto Mono" w:hAnsi="Roboto Mono"/>
-        </w:rPr>
-        <w:t xml:space="preserve"> SVG --&gt;</w:t>
+        <w:t>    &lt;!-- SVG --&gt;</w:t>
       </w:r>
     </w:p>
     <w:p>
@@ -7642,19 +7417,11 @@
                 <w:rFonts w:ascii="Roboto Mono" w:hAnsi="Roboto Mono"/>
               </w:rPr>
             </w:pPr>
-            <w:proofErr w:type="gramStart"/>
             <w:r>
               <w:rPr>
                 <w:rFonts w:ascii="Roboto Mono" w:hAnsi="Roboto Mono"/>
               </w:rPr>
-              <w:t>moveTo(</w:t>
-            </w:r>
-            <w:proofErr w:type="gramEnd"/>
-            <w:r>
-              <w:rPr>
-                <w:rFonts w:ascii="Roboto Mono" w:hAnsi="Roboto Mono"/>
-              </w:rPr>
-              <w:t>)</w:t>
+              <w:t>moveTo()</w:t>
             </w:r>
           </w:p>
         </w:tc>
@@ -7695,19 +7462,11 @@
                 <w:rFonts w:ascii="Roboto Mono" w:hAnsi="Roboto Mono"/>
               </w:rPr>
             </w:pPr>
-            <w:proofErr w:type="gramStart"/>
             <w:r>
               <w:rPr>
                 <w:rFonts w:ascii="Roboto Mono" w:hAnsi="Roboto Mono"/>
               </w:rPr>
-              <w:t>lineTo(</w:t>
-            </w:r>
-            <w:proofErr w:type="gramEnd"/>
-            <w:r>
-              <w:rPr>
-                <w:rFonts w:ascii="Roboto Mono" w:hAnsi="Roboto Mono"/>
-              </w:rPr>
-              <w:t>)</w:t>
+              <w:t>lineTo()</w:t>
             </w:r>
           </w:p>
         </w:tc>
@@ -7748,19 +7507,11 @@
                 <w:rFonts w:ascii="Roboto Mono" w:hAnsi="Roboto Mono"/>
               </w:rPr>
             </w:pPr>
-            <w:proofErr w:type="gramStart"/>
             <w:r>
               <w:rPr>
                 <w:rFonts w:ascii="Roboto Mono" w:hAnsi="Roboto Mono"/>
               </w:rPr>
-              <w:t>arc(</w:t>
-            </w:r>
-            <w:proofErr w:type="gramEnd"/>
-            <w:r>
-              <w:rPr>
-                <w:rFonts w:ascii="Roboto Mono" w:hAnsi="Roboto Mono"/>
-              </w:rPr>
-              <w:t>)</w:t>
+              <w:t>arc()</w:t>
             </w:r>
           </w:p>
         </w:tc>
@@ -7801,19 +7552,11 @@
                 <w:rFonts w:ascii="Roboto Mono" w:hAnsi="Roboto Mono"/>
               </w:rPr>
             </w:pPr>
-            <w:proofErr w:type="gramStart"/>
             <w:r>
               <w:rPr>
                 <w:rFonts w:ascii="Roboto Mono" w:hAnsi="Roboto Mono"/>
               </w:rPr>
-              <w:t>fillText(</w:t>
-            </w:r>
-            <w:proofErr w:type="gramEnd"/>
-            <w:r>
-              <w:rPr>
-                <w:rFonts w:ascii="Roboto Mono" w:hAnsi="Roboto Mono"/>
-              </w:rPr>
-              <w:t>)</w:t>
+              <w:t>fillText()</w:t>
             </w:r>
           </w:p>
         </w:tc>
@@ -7854,19 +7597,11 @@
                 <w:rFonts w:ascii="Roboto Mono" w:hAnsi="Roboto Mono"/>
               </w:rPr>
             </w:pPr>
-            <w:proofErr w:type="gramStart"/>
             <w:r>
               <w:rPr>
                 <w:rFonts w:ascii="Roboto Mono" w:hAnsi="Roboto Mono"/>
               </w:rPr>
-              <w:t>strokeText(</w:t>
-            </w:r>
-            <w:proofErr w:type="gramEnd"/>
-            <w:r>
-              <w:rPr>
-                <w:rFonts w:ascii="Roboto Mono" w:hAnsi="Roboto Mono"/>
-              </w:rPr>
-              <w:t>)</w:t>
+              <w:t>strokeText()</w:t>
             </w:r>
           </w:p>
         </w:tc>
@@ -7907,19 +7642,11 @@
                 <w:rFonts w:ascii="Roboto Mono" w:hAnsi="Roboto Mono"/>
               </w:rPr>
             </w:pPr>
-            <w:proofErr w:type="gramStart"/>
             <w:r>
               <w:rPr>
                 <w:rFonts w:ascii="Roboto Mono" w:hAnsi="Roboto Mono"/>
               </w:rPr>
-              <w:t>createLinearGradient(</w:t>
-            </w:r>
-            <w:proofErr w:type="gramEnd"/>
-            <w:r>
-              <w:rPr>
-                <w:rFonts w:ascii="Roboto Mono" w:hAnsi="Roboto Mono"/>
-              </w:rPr>
-              <w:t>)</w:t>
+              <w:t>createLinearGradient()</w:t>
             </w:r>
           </w:p>
         </w:tc>
@@ -7960,19 +7687,11 @@
                 <w:rFonts w:ascii="Roboto Mono" w:hAnsi="Roboto Mono"/>
               </w:rPr>
             </w:pPr>
-            <w:proofErr w:type="gramStart"/>
             <w:r>
               <w:rPr>
                 <w:rFonts w:ascii="Roboto Mono" w:hAnsi="Roboto Mono"/>
               </w:rPr>
-              <w:t>createRadialGradient(</w:t>
-            </w:r>
-            <w:proofErr w:type="gramEnd"/>
-            <w:r>
-              <w:rPr>
-                <w:rFonts w:ascii="Roboto Mono" w:hAnsi="Roboto Mono"/>
-              </w:rPr>
-              <w:t>)</w:t>
+              <w:t>createRadialGradient()</w:t>
             </w:r>
           </w:p>
         </w:tc>
@@ -8013,19 +7732,11 @@
                 <w:rFonts w:ascii="Roboto Mono" w:hAnsi="Roboto Mono"/>
               </w:rPr>
             </w:pPr>
-            <w:proofErr w:type="gramStart"/>
             <w:r>
               <w:rPr>
                 <w:rFonts w:ascii="Roboto Mono" w:hAnsi="Roboto Mono"/>
               </w:rPr>
-              <w:t>drawImage(</w:t>
-            </w:r>
-            <w:proofErr w:type="gramEnd"/>
-            <w:r>
-              <w:rPr>
-                <w:rFonts w:ascii="Roboto Mono" w:hAnsi="Roboto Mono"/>
-              </w:rPr>
-              <w:t>)</w:t>
+              <w:t>drawImage()</w:t>
             </w:r>
           </w:p>
         </w:tc>
@@ -8343,114 +8054,47 @@
           <w:rFonts w:ascii="Roboto Mono" w:hAnsi="Roboto Mono"/>
         </w:rPr>
         <w:br/>
-        <w:t xml:space="preserve">let c = </w:t>
-      </w:r>
-      <w:proofErr w:type="gramStart"/>
-      <w:r>
-        <w:rPr>
-          <w:rFonts w:ascii="Roboto Mono" w:hAnsi="Roboto Mono"/>
-        </w:rPr>
-        <w:t>document.getElementById</w:t>
-      </w:r>
-      <w:proofErr w:type="gramEnd"/>
-      <w:r>
-        <w:rPr>
-          <w:rFonts w:ascii="Roboto Mono" w:hAnsi="Roboto Mono"/>
-        </w:rPr>
-        <w:t>("myCanvas");</w:t>
-      </w:r>
-      <w:r>
-        <w:rPr>
-          <w:rFonts w:ascii="Roboto Mono" w:hAnsi="Roboto Mono"/>
-        </w:rPr>
-        <w:br/>
-        <w:t xml:space="preserve">let ctx = </w:t>
-      </w:r>
-      <w:proofErr w:type="gramStart"/>
-      <w:r>
-        <w:rPr>
-          <w:rFonts w:ascii="Roboto Mono" w:hAnsi="Roboto Mono"/>
-        </w:rPr>
-        <w:t>c.getContext</w:t>
-      </w:r>
-      <w:proofErr w:type="gramEnd"/>
-      <w:r>
-        <w:rPr>
-          <w:rFonts w:ascii="Roboto Mono" w:hAnsi="Roboto Mono"/>
-        </w:rPr>
-        <w:t>("2d");</w:t>
-      </w:r>
-      <w:r>
-        <w:rPr>
-          <w:rFonts w:ascii="Roboto Mono" w:hAnsi="Roboto Mono"/>
-        </w:rPr>
-        <w:br/>
-      </w:r>
-      <w:r>
-        <w:rPr>
-          <w:rFonts w:ascii="Roboto Mono" w:hAnsi="Roboto Mono"/>
-        </w:rPr>
-        <w:br/>
-      </w:r>
-      <w:proofErr w:type="gramStart"/>
-      <w:r>
-        <w:rPr>
-          <w:rFonts w:ascii="Roboto Mono" w:hAnsi="Roboto Mono"/>
-        </w:rPr>
-        <w:t>ctx.moveTo</w:t>
-      </w:r>
-      <w:proofErr w:type="gramEnd"/>
-      <w:r>
-        <w:rPr>
-          <w:rFonts w:ascii="Roboto Mono" w:hAnsi="Roboto Mono"/>
-        </w:rPr>
-        <w:t>(0, 0);</w:t>
-      </w:r>
-      <w:r>
-        <w:rPr>
-          <w:rFonts w:ascii="Roboto Mono" w:hAnsi="Roboto Mono"/>
-        </w:rPr>
-        <w:br/>
-      </w:r>
-      <w:proofErr w:type="gramStart"/>
-      <w:r>
-        <w:rPr>
-          <w:rFonts w:ascii="Roboto Mono" w:hAnsi="Roboto Mono"/>
-        </w:rPr>
-        <w:t>ctx.lineTo</w:t>
-      </w:r>
-      <w:proofErr w:type="gramEnd"/>
-      <w:r>
-        <w:rPr>
-          <w:rFonts w:ascii="Roboto Mono" w:hAnsi="Roboto Mono"/>
-        </w:rPr>
-        <w:t>(200, 100);</w:t>
-      </w:r>
-      <w:r>
-        <w:rPr>
-          <w:rFonts w:ascii="Roboto Mono" w:hAnsi="Roboto Mono"/>
-        </w:rPr>
-        <w:br/>
-      </w:r>
-      <w:r>
-        <w:rPr>
-          <w:rFonts w:ascii="Roboto Mono" w:hAnsi="Roboto Mono"/>
-        </w:rPr>
-        <w:br/>
-      </w:r>
-      <w:proofErr w:type="gramStart"/>
-      <w:r>
-        <w:rPr>
-          <w:rFonts w:ascii="Roboto Mono" w:hAnsi="Roboto Mono"/>
-        </w:rPr>
-        <w:t>ctx.stroke</w:t>
-      </w:r>
-      <w:proofErr w:type="gramEnd"/>
-      <w:r>
-        <w:rPr>
-          <w:rFonts w:ascii="Roboto Mono" w:hAnsi="Roboto Mono"/>
-        </w:rPr>
-        <w:t>();</w:t>
+        <w:t>let c = document.getElementById("myCanvas");</w:t>
+      </w:r>
+      <w:r>
+        <w:rPr>
+          <w:rFonts w:ascii="Roboto Mono" w:hAnsi="Roboto Mono"/>
+        </w:rPr>
+        <w:br/>
+        <w:t>let ctx = c.getContext("2d");</w:t>
+      </w:r>
+      <w:r>
+        <w:rPr>
+          <w:rFonts w:ascii="Roboto Mono" w:hAnsi="Roboto Mono"/>
+        </w:rPr>
+        <w:br/>
+      </w:r>
+      <w:r>
+        <w:rPr>
+          <w:rFonts w:ascii="Roboto Mono" w:hAnsi="Roboto Mono"/>
+        </w:rPr>
+        <w:br/>
+        <w:t>ctx.moveTo(0, 0);</w:t>
+      </w:r>
+      <w:r>
+        <w:rPr>
+          <w:rFonts w:ascii="Roboto Mono" w:hAnsi="Roboto Mono"/>
+        </w:rPr>
+        <w:br/>
+        <w:t>ctx.lineTo(200, 100);</w:t>
+      </w:r>
+      <w:r>
+        <w:rPr>
+          <w:rFonts w:ascii="Roboto Mono" w:hAnsi="Roboto Mono"/>
+        </w:rPr>
+        <w:br/>
+      </w:r>
+      <w:r>
+        <w:rPr>
+          <w:rFonts w:ascii="Roboto Mono" w:hAnsi="Roboto Mono"/>
+        </w:rPr>
+        <w:br/>
+        <w:t>ctx.stroke();</w:t>
       </w:r>
       <w:r>
         <w:rPr>
@@ -8611,21 +8255,7 @@
         <w:rPr>
           <w:rFonts w:ascii="Roboto Mono" w:hAnsi="Roboto Mono"/>
         </w:rPr>
-        <w:t xml:space="preserve">Draws a circle using </w:t>
-      </w:r>
-      <w:proofErr w:type="gramStart"/>
-      <w:r>
-        <w:rPr>
-          <w:rFonts w:ascii="Roboto Mono" w:hAnsi="Roboto Mono"/>
-        </w:rPr>
-        <w:t>arc(</w:t>
-      </w:r>
-      <w:proofErr w:type="gramEnd"/>
-      <w:r>
-        <w:rPr>
-          <w:rFonts w:ascii="Roboto Mono" w:hAnsi="Roboto Mono"/>
-        </w:rPr>
-        <w:t>).</w:t>
+        <w:t>Draws a circle using arc().</w:t>
       </w:r>
     </w:p>
     <w:p>
@@ -8772,121 +8402,59 @@
           <w:rFonts w:ascii="Roboto Mono" w:hAnsi="Roboto Mono"/>
         </w:rPr>
         <w:br/>
-        <w:t xml:space="preserve">let c = </w:t>
-      </w:r>
-      <w:proofErr w:type="gramStart"/>
-      <w:r>
-        <w:rPr>
-          <w:rFonts w:ascii="Roboto Mono" w:hAnsi="Roboto Mono"/>
-        </w:rPr>
-        <w:t>document.getElementById</w:t>
-      </w:r>
-      <w:proofErr w:type="gramEnd"/>
-      <w:r>
-        <w:rPr>
-          <w:rFonts w:ascii="Roboto Mono" w:hAnsi="Roboto Mono"/>
-        </w:rPr>
-        <w:t>("myCanvas");</w:t>
-      </w:r>
-      <w:r>
-        <w:rPr>
-          <w:rFonts w:ascii="Roboto Mono" w:hAnsi="Roboto Mono"/>
-        </w:rPr>
-        <w:br/>
-        <w:t xml:space="preserve">let ctx = </w:t>
-      </w:r>
-      <w:proofErr w:type="gramStart"/>
-      <w:r>
-        <w:rPr>
-          <w:rFonts w:ascii="Roboto Mono" w:hAnsi="Roboto Mono"/>
-        </w:rPr>
-        <w:t>c.getContext</w:t>
-      </w:r>
-      <w:proofErr w:type="gramEnd"/>
-      <w:r>
-        <w:rPr>
-          <w:rFonts w:ascii="Roboto Mono" w:hAnsi="Roboto Mono"/>
-        </w:rPr>
-        <w:t>("2d");</w:t>
-      </w:r>
-      <w:r>
-        <w:rPr>
-          <w:rFonts w:ascii="Roboto Mono" w:hAnsi="Roboto Mono"/>
-        </w:rPr>
-        <w:br/>
-      </w:r>
-      <w:r>
-        <w:rPr>
-          <w:rFonts w:ascii="Roboto Mono" w:hAnsi="Roboto Mono"/>
-        </w:rPr>
-        <w:br/>
-      </w:r>
-      <w:proofErr w:type="gramStart"/>
-      <w:r>
-        <w:rPr>
-          <w:rFonts w:ascii="Roboto Mono" w:hAnsi="Roboto Mono"/>
-        </w:rPr>
-        <w:t>ctx.beginPath</w:t>
-      </w:r>
-      <w:proofErr w:type="gramEnd"/>
-      <w:r>
-        <w:rPr>
-          <w:rFonts w:ascii="Roboto Mono" w:hAnsi="Roboto Mono"/>
-        </w:rPr>
-        <w:t>();</w:t>
-      </w:r>
-      <w:r>
-        <w:rPr>
-          <w:rFonts w:ascii="Roboto Mono" w:hAnsi="Roboto Mono"/>
-        </w:rPr>
-        <w:br/>
-      </w:r>
-      <w:r>
-        <w:rPr>
-          <w:rFonts w:ascii="Roboto Mono" w:hAnsi="Roboto Mono"/>
-        </w:rPr>
-        <w:br/>
-      </w:r>
-      <w:proofErr w:type="gramStart"/>
-      <w:r>
-        <w:rPr>
-          <w:rFonts w:ascii="Roboto Mono" w:hAnsi="Roboto Mono"/>
-        </w:rPr>
-        <w:t>ctx.arc(</w:t>
-      </w:r>
-      <w:proofErr w:type="gramEnd"/>
-      <w:r>
-        <w:rPr>
-          <w:rFonts w:ascii="Roboto Mono" w:hAnsi="Roboto Mono"/>
-        </w:rPr>
-        <w:t>100, 100, 50, 0, 2 * Math.PI);</w:t>
-      </w:r>
-      <w:r>
-        <w:rPr>
-          <w:rFonts w:ascii="Roboto Mono" w:hAnsi="Roboto Mono"/>
-        </w:rPr>
-        <w:br/>
-      </w:r>
-      <w:r>
-        <w:rPr>
-          <w:rFonts w:ascii="Roboto Mono" w:hAnsi="Roboto Mono"/>
-        </w:rPr>
-        <w:br/>
-      </w:r>
-      <w:proofErr w:type="gramStart"/>
+        <w:t>let c = document.getElementById("myCanvas");</w:t>
+      </w:r>
+      <w:r>
+        <w:rPr>
+          <w:rFonts w:ascii="Roboto Mono" w:hAnsi="Roboto Mono"/>
+        </w:rPr>
+        <w:br/>
+        <w:t>let ctx = c.getContext("2d");</w:t>
+      </w:r>
+      <w:r>
+        <w:rPr>
+          <w:rFonts w:ascii="Roboto Mono" w:hAnsi="Roboto Mono"/>
+        </w:rPr>
+        <w:br/>
+      </w:r>
+      <w:r>
+        <w:rPr>
+          <w:rFonts w:ascii="Roboto Mono" w:hAnsi="Roboto Mono"/>
+        </w:rPr>
+        <w:br/>
+        <w:t>ctx.beginPath();</w:t>
+      </w:r>
+      <w:r>
+        <w:rPr>
+          <w:rFonts w:ascii="Roboto Mono" w:hAnsi="Roboto Mono"/>
+        </w:rPr>
+        <w:br/>
+      </w:r>
+      <w:r>
+        <w:rPr>
+          <w:rFonts w:ascii="Roboto Mono" w:hAnsi="Roboto Mono"/>
+        </w:rPr>
+        <w:br/>
+        <w:t>ctx.arc(100, 100, 50, 0, 2 * Math.PI);</w:t>
+      </w:r>
+      <w:r>
+        <w:rPr>
+          <w:rFonts w:ascii="Roboto Mono" w:hAnsi="Roboto Mono"/>
+        </w:rPr>
+        <w:br/>
+      </w:r>
+      <w:r>
+        <w:rPr>
+          <w:rFonts w:ascii="Roboto Mono" w:hAnsi="Roboto Mono"/>
+        </w:rPr>
+        <w:br/>
+      </w:r>
       <w:r>
         <w:rPr>
           <w:rFonts w:ascii="Roboto Mono" w:hAnsi="Roboto Mono"/>
         </w:rPr>
         <w:lastRenderedPageBreak/>
-        <w:t>ctx.stroke</w:t>
-      </w:r>
-      <w:proofErr w:type="gramEnd"/>
-      <w:r>
-        <w:rPr>
-          <w:rFonts w:ascii="Roboto Mono" w:hAnsi="Roboto Mono"/>
-        </w:rPr>
-        <w:t>();</w:t>
+        <w:t>ctx.stroke();</w:t>
       </w:r>
       <w:r>
         <w:rPr>
@@ -9193,42 +8761,14 @@
           <w:rFonts w:ascii="Roboto Mono" w:hAnsi="Roboto Mono"/>
         </w:rPr>
         <w:br/>
-        <w:t xml:space="preserve">let c = </w:t>
-      </w:r>
-      <w:proofErr w:type="gramStart"/>
-      <w:r>
-        <w:rPr>
-          <w:rFonts w:ascii="Roboto Mono" w:hAnsi="Roboto Mono"/>
-        </w:rPr>
-        <w:t>document.getElementById</w:t>
-      </w:r>
-      <w:proofErr w:type="gramEnd"/>
-      <w:r>
-        <w:rPr>
-          <w:rFonts w:ascii="Roboto Mono" w:hAnsi="Roboto Mono"/>
-        </w:rPr>
-        <w:t>("myCanvas");</w:t>
-      </w:r>
-      <w:r>
-        <w:rPr>
-          <w:rFonts w:ascii="Roboto Mono" w:hAnsi="Roboto Mono"/>
-        </w:rPr>
-        <w:br/>
-        <w:t xml:space="preserve">let ctx = </w:t>
-      </w:r>
-      <w:proofErr w:type="gramStart"/>
-      <w:r>
-        <w:rPr>
-          <w:rFonts w:ascii="Roboto Mono" w:hAnsi="Roboto Mono"/>
-        </w:rPr>
-        <w:t>c.getContext</w:t>
-      </w:r>
-      <w:proofErr w:type="gramEnd"/>
-      <w:r>
-        <w:rPr>
-          <w:rFonts w:ascii="Roboto Mono" w:hAnsi="Roboto Mono"/>
-        </w:rPr>
-        <w:t>("2d");</w:t>
+        <w:t>let c = document.getElementById("myCanvas");</w:t>
+      </w:r>
+      <w:r>
+        <w:rPr>
+          <w:rFonts w:ascii="Roboto Mono" w:hAnsi="Roboto Mono"/>
+        </w:rPr>
+        <w:br/>
+        <w:t>let ctx = c.getContext("2d");</w:t>
       </w:r>
       <w:r>
         <w:rPr>
@@ -9260,20 +8800,7 @@
           <w:rFonts w:ascii="Roboto Mono" w:hAnsi="Roboto Mono"/>
         </w:rPr>
         <w:br/>
-      </w:r>
-      <w:proofErr w:type="gramStart"/>
-      <w:r>
-        <w:rPr>
-          <w:rFonts w:ascii="Roboto Mono" w:hAnsi="Roboto Mono"/>
-        </w:rPr>
-        <w:t>ctx.fillText</w:t>
-      </w:r>
-      <w:proofErr w:type="gramEnd"/>
-      <w:r>
-        <w:rPr>
-          <w:rFonts w:ascii="Roboto Mono" w:hAnsi="Roboto Mono"/>
-        </w:rPr>
-        <w:t>("Hello Canvas", 20, 50);</w:t>
+        <w:t>ctx.fillText("Hello Canvas", 20, 50);</w:t>
       </w:r>
       <w:r>
         <w:rPr>
@@ -9580,21 +9107,7 @@
           <w:rFonts w:ascii="Roboto Mono" w:hAnsi="Roboto Mono"/>
         </w:rPr>
         <w:br/>
-        <w:t xml:space="preserve">let c = </w:t>
-      </w:r>
-      <w:proofErr w:type="gramStart"/>
-      <w:r>
-        <w:rPr>
-          <w:rFonts w:ascii="Roboto Mono" w:hAnsi="Roboto Mono"/>
-        </w:rPr>
-        <w:t>document.getElementById</w:t>
-      </w:r>
-      <w:proofErr w:type="gramEnd"/>
-      <w:r>
-        <w:rPr>
-          <w:rFonts w:ascii="Roboto Mono" w:hAnsi="Roboto Mono"/>
-        </w:rPr>
-        <w:t>("myCanvas");</w:t>
+        <w:t>let c = document.getElementById("myCanvas");</w:t>
       </w:r>
       <w:r>
         <w:rPr>
@@ -9607,21 +9120,7 @@
           <w:rFonts w:ascii="Roboto Mono" w:hAnsi="Roboto Mono"/>
         </w:rPr>
         <w:lastRenderedPageBreak/>
-        <w:t xml:space="preserve">let ctx = </w:t>
-      </w:r>
-      <w:proofErr w:type="gramStart"/>
-      <w:r>
-        <w:rPr>
-          <w:rFonts w:ascii="Roboto Mono" w:hAnsi="Roboto Mono"/>
-        </w:rPr>
-        <w:t>c.getContext</w:t>
-      </w:r>
-      <w:proofErr w:type="gramEnd"/>
-      <w:r>
-        <w:rPr>
-          <w:rFonts w:ascii="Roboto Mono" w:hAnsi="Roboto Mono"/>
-        </w:rPr>
-        <w:t>("2d");</w:t>
+        <w:t>let ctx = c.getContext("2d");</w:t>
       </w:r>
       <w:r>
         <w:rPr>
@@ -9647,20 +9146,7 @@
           <w:rFonts w:ascii="Roboto Mono" w:hAnsi="Roboto Mono"/>
         </w:rPr>
         <w:br/>
-      </w:r>
-      <w:proofErr w:type="gramStart"/>
-      <w:r>
-        <w:rPr>
-          <w:rFonts w:ascii="Roboto Mono" w:hAnsi="Roboto Mono"/>
-        </w:rPr>
-        <w:t>ctx.strokeText</w:t>
-      </w:r>
-      <w:proofErr w:type="gramEnd"/>
-      <w:r>
-        <w:rPr>
-          <w:rFonts w:ascii="Roboto Mono" w:hAnsi="Roboto Mono"/>
-        </w:rPr>
-        <w:t>("Canvas", 20, 50);</w:t>
+        <w:t>ctx.strokeText("Canvas", 20, 50);</w:t>
       </w:r>
       <w:r>
         <w:rPr>
@@ -10837,95 +10323,40 @@
           <w:rFonts w:ascii="Roboto Mono" w:hAnsi="Roboto Mono"/>
         </w:rPr>
         <w:br/>
-        <w:t xml:space="preserve">let c = </w:t>
-      </w:r>
-      <w:proofErr w:type="gramStart"/>
-      <w:r>
-        <w:rPr>
-          <w:rFonts w:ascii="Roboto Mono" w:hAnsi="Roboto Mono"/>
-        </w:rPr>
-        <w:t>document.getElementById</w:t>
-      </w:r>
-      <w:proofErr w:type="gramEnd"/>
-      <w:r>
-        <w:rPr>
-          <w:rFonts w:ascii="Roboto Mono" w:hAnsi="Roboto Mono"/>
-        </w:rPr>
-        <w:t>("myCanvas");</w:t>
-      </w:r>
-      <w:r>
-        <w:rPr>
-          <w:rFonts w:ascii="Roboto Mono" w:hAnsi="Roboto Mono"/>
-        </w:rPr>
-        <w:br/>
-        <w:t xml:space="preserve">let ctx = </w:t>
-      </w:r>
-      <w:proofErr w:type="gramStart"/>
-      <w:r>
-        <w:rPr>
-          <w:rFonts w:ascii="Roboto Mono" w:hAnsi="Roboto Mono"/>
-        </w:rPr>
-        <w:t>c.getContext</w:t>
-      </w:r>
-      <w:proofErr w:type="gramEnd"/>
-      <w:r>
-        <w:rPr>
-          <w:rFonts w:ascii="Roboto Mono" w:hAnsi="Roboto Mono"/>
-        </w:rPr>
-        <w:t>("2d");</w:t>
-      </w:r>
-      <w:r>
-        <w:rPr>
-          <w:rFonts w:ascii="Roboto Mono" w:hAnsi="Roboto Mono"/>
-        </w:rPr>
-        <w:br/>
-      </w:r>
-      <w:r>
-        <w:rPr>
-          <w:rFonts w:ascii="Roboto Mono" w:hAnsi="Roboto Mono"/>
-        </w:rPr>
-        <w:br/>
-        <w:t xml:space="preserve">let img = </w:t>
-      </w:r>
-      <w:proofErr w:type="gramStart"/>
-      <w:r>
-        <w:rPr>
-          <w:rFonts w:ascii="Roboto Mono" w:hAnsi="Roboto Mono"/>
-        </w:rPr>
-        <w:t>document.getElementById</w:t>
-      </w:r>
-      <w:proofErr w:type="gramEnd"/>
-      <w:r>
-        <w:rPr>
-          <w:rFonts w:ascii="Roboto Mono" w:hAnsi="Roboto Mono"/>
-        </w:rPr>
-        <w:t>("photo");</w:t>
-      </w:r>
-      <w:r>
-        <w:rPr>
-          <w:rFonts w:ascii="Roboto Mono" w:hAnsi="Roboto Mono"/>
-        </w:rPr>
-        <w:br/>
-      </w:r>
-      <w:r>
-        <w:rPr>
-          <w:rFonts w:ascii="Roboto Mono" w:hAnsi="Roboto Mono"/>
-        </w:rPr>
-        <w:br/>
-      </w:r>
-      <w:proofErr w:type="gramStart"/>
-      <w:r>
-        <w:rPr>
-          <w:rFonts w:ascii="Roboto Mono" w:hAnsi="Roboto Mono"/>
-        </w:rPr>
-        <w:t>ctx.drawImage</w:t>
-      </w:r>
-      <w:proofErr w:type="gramEnd"/>
-      <w:r>
-        <w:rPr>
-          <w:rFonts w:ascii="Roboto Mono" w:hAnsi="Roboto Mono"/>
-        </w:rPr>
-        <w:t>(img, 20, 20, 200, 150);</w:t>
+        <w:t>let c = document.getElementById("myCanvas");</w:t>
+      </w:r>
+      <w:r>
+        <w:rPr>
+          <w:rFonts w:ascii="Roboto Mono" w:hAnsi="Roboto Mono"/>
+        </w:rPr>
+        <w:br/>
+        <w:t>let ctx = c.getContext("2d");</w:t>
+      </w:r>
+      <w:r>
+        <w:rPr>
+          <w:rFonts w:ascii="Roboto Mono" w:hAnsi="Roboto Mono"/>
+        </w:rPr>
+        <w:br/>
+      </w:r>
+      <w:r>
+        <w:rPr>
+          <w:rFonts w:ascii="Roboto Mono" w:hAnsi="Roboto Mono"/>
+        </w:rPr>
+        <w:br/>
+        <w:t>let img = document.getElementById("photo");</w:t>
+      </w:r>
+      <w:r>
+        <w:rPr>
+          <w:rFonts w:ascii="Roboto Mono" w:hAnsi="Roboto Mono"/>
+        </w:rPr>
+        <w:br/>
+      </w:r>
+      <w:r>
+        <w:rPr>
+          <w:rFonts w:ascii="Roboto Mono" w:hAnsi="Roboto Mono"/>
+        </w:rPr>
+        <w:br/>
+        <w:t>ctx.drawImage(img, 20, 20, 200, 150);</w:t>
       </w:r>
       <w:r>
         <w:rPr>
@@ -12380,48 +11811,20 @@
         <w:rPr>
           <w:rFonts w:ascii="Roboto Mono" w:hAnsi="Roboto Mono"/>
         </w:rPr>
-        <w:t xml:space="preserve">        let c = </w:t>
-      </w:r>
-      <w:proofErr w:type="gramStart"/>
-      <w:r>
-        <w:rPr>
-          <w:rFonts w:ascii="Roboto Mono" w:hAnsi="Roboto Mono"/>
-        </w:rPr>
-        <w:t>document.getElementById</w:t>
-      </w:r>
-      <w:proofErr w:type="gramEnd"/>
-      <w:r>
-        <w:rPr>
-          <w:rFonts w:ascii="Roboto Mono" w:hAnsi="Roboto Mono"/>
-        </w:rPr>
-        <w:t>("myCanvas");</w:t>
-      </w:r>
-    </w:p>
-    <w:p>
-      <w:pPr>
-        <w:rPr>
-          <w:rFonts w:ascii="Roboto Mono" w:hAnsi="Roboto Mono"/>
-        </w:rPr>
-      </w:pPr>
-      <w:r>
-        <w:rPr>
-          <w:rFonts w:ascii="Roboto Mono" w:hAnsi="Roboto Mono"/>
-        </w:rPr>
-        <w:t xml:space="preserve">        let ctx = </w:t>
-      </w:r>
-      <w:proofErr w:type="gramStart"/>
-      <w:r>
-        <w:rPr>
-          <w:rFonts w:ascii="Roboto Mono" w:hAnsi="Roboto Mono"/>
-        </w:rPr>
-        <w:t>c.getContext</w:t>
-      </w:r>
-      <w:proofErr w:type="gramEnd"/>
-      <w:r>
-        <w:rPr>
-          <w:rFonts w:ascii="Roboto Mono" w:hAnsi="Roboto Mono"/>
-        </w:rPr>
-        <w:t>("2d");</w:t>
+        <w:t>        let c = document.getElementById("myCanvas");</w:t>
+      </w:r>
+    </w:p>
+    <w:p>
+      <w:pPr>
+        <w:rPr>
+          <w:rFonts w:ascii="Roboto Mono" w:hAnsi="Roboto Mono"/>
+        </w:rPr>
+      </w:pPr>
+      <w:r>
+        <w:rPr>
+          <w:rFonts w:ascii="Roboto Mono" w:hAnsi="Roboto Mono"/>
+        </w:rPr>
+        <w:t>        let ctx = c.getContext("2d");</w:t>
       </w:r>
     </w:p>
     <w:p>
@@ -12454,75 +11857,33 @@
         <w:rPr>
           <w:rFonts w:ascii="Roboto Mono" w:hAnsi="Roboto Mono"/>
         </w:rPr>
-        <w:t xml:space="preserve">        </w:t>
-      </w:r>
-      <w:proofErr w:type="gramStart"/>
-      <w:r>
-        <w:rPr>
-          <w:rFonts w:ascii="Roboto Mono" w:hAnsi="Roboto Mono"/>
-        </w:rPr>
-        <w:t>ctx.moveTo</w:t>
-      </w:r>
-      <w:proofErr w:type="gramEnd"/>
-      <w:r>
-        <w:rPr>
-          <w:rFonts w:ascii="Roboto Mono" w:hAnsi="Roboto Mono"/>
-        </w:rPr>
-        <w:t>(20, 20);</w:t>
-      </w:r>
-    </w:p>
-    <w:p>
-      <w:pPr>
-        <w:rPr>
-          <w:rFonts w:ascii="Roboto Mono" w:hAnsi="Roboto Mono"/>
-        </w:rPr>
-      </w:pPr>
-      <w:r>
-        <w:rPr>
-          <w:rFonts w:ascii="Roboto Mono" w:hAnsi="Roboto Mono"/>
-        </w:rPr>
-        <w:t xml:space="preserve">        </w:t>
-      </w:r>
-      <w:proofErr w:type="gramStart"/>
-      <w:r>
-        <w:rPr>
-          <w:rFonts w:ascii="Roboto Mono" w:hAnsi="Roboto Mono"/>
-        </w:rPr>
-        <w:t>ctx.lineTo</w:t>
-      </w:r>
-      <w:proofErr w:type="gramEnd"/>
-      <w:r>
-        <w:rPr>
-          <w:rFonts w:ascii="Roboto Mono" w:hAnsi="Roboto Mono"/>
-        </w:rPr>
-        <w:t>(200, 20);</w:t>
-      </w:r>
-    </w:p>
-    <w:p>
-      <w:pPr>
-        <w:rPr>
-          <w:rFonts w:ascii="Roboto Mono" w:hAnsi="Roboto Mono"/>
-        </w:rPr>
-      </w:pPr>
-      <w:r>
-        <w:rPr>
-          <w:rFonts w:ascii="Roboto Mono" w:hAnsi="Roboto Mono"/>
-        </w:rPr>
-        <w:t xml:space="preserve">        </w:t>
-      </w:r>
-      <w:proofErr w:type="gramStart"/>
-      <w:r>
-        <w:rPr>
-          <w:rFonts w:ascii="Roboto Mono" w:hAnsi="Roboto Mono"/>
-        </w:rPr>
-        <w:t>ctx.stroke</w:t>
-      </w:r>
-      <w:proofErr w:type="gramEnd"/>
-      <w:r>
-        <w:rPr>
-          <w:rFonts w:ascii="Roboto Mono" w:hAnsi="Roboto Mono"/>
-        </w:rPr>
-        <w:t>();</w:t>
+        <w:t>        ctx.moveTo(20, 20);</w:t>
+      </w:r>
+    </w:p>
+    <w:p>
+      <w:pPr>
+        <w:rPr>
+          <w:rFonts w:ascii="Roboto Mono" w:hAnsi="Roboto Mono"/>
+        </w:rPr>
+      </w:pPr>
+      <w:r>
+        <w:rPr>
+          <w:rFonts w:ascii="Roboto Mono" w:hAnsi="Roboto Mono"/>
+        </w:rPr>
+        <w:t>        ctx.lineTo(200, 20);</w:t>
+      </w:r>
+    </w:p>
+    <w:p>
+      <w:pPr>
+        <w:rPr>
+          <w:rFonts w:ascii="Roboto Mono" w:hAnsi="Roboto Mono"/>
+        </w:rPr>
+      </w:pPr>
+      <w:r>
+        <w:rPr>
+          <w:rFonts w:ascii="Roboto Mono" w:hAnsi="Roboto Mono"/>
+        </w:rPr>
+        <w:t>        ctx.stroke();</w:t>
       </w:r>
     </w:p>
     <w:p>
@@ -12555,75 +11916,33 @@
         <w:rPr>
           <w:rFonts w:ascii="Roboto Mono" w:hAnsi="Roboto Mono"/>
         </w:rPr>
-        <w:t xml:space="preserve">        </w:t>
-      </w:r>
-      <w:proofErr w:type="gramStart"/>
-      <w:r>
-        <w:rPr>
-          <w:rFonts w:ascii="Roboto Mono" w:hAnsi="Roboto Mono"/>
-        </w:rPr>
-        <w:t>ctx.beginPath</w:t>
-      </w:r>
-      <w:proofErr w:type="gramEnd"/>
-      <w:r>
-        <w:rPr>
-          <w:rFonts w:ascii="Roboto Mono" w:hAnsi="Roboto Mono"/>
-        </w:rPr>
-        <w:t>();</w:t>
-      </w:r>
-    </w:p>
-    <w:p>
-      <w:pPr>
-        <w:rPr>
-          <w:rFonts w:ascii="Roboto Mono" w:hAnsi="Roboto Mono"/>
-        </w:rPr>
-      </w:pPr>
-      <w:r>
-        <w:rPr>
-          <w:rFonts w:ascii="Roboto Mono" w:hAnsi="Roboto Mono"/>
-        </w:rPr>
-        <w:t xml:space="preserve">        </w:t>
-      </w:r>
-      <w:proofErr w:type="gramStart"/>
-      <w:r>
-        <w:rPr>
-          <w:rFonts w:ascii="Roboto Mono" w:hAnsi="Roboto Mono"/>
-        </w:rPr>
-        <w:t>ctx.arc(</w:t>
-      </w:r>
-      <w:proofErr w:type="gramEnd"/>
-      <w:r>
-        <w:rPr>
-          <w:rFonts w:ascii="Roboto Mono" w:hAnsi="Roboto Mono"/>
-        </w:rPr>
-        <w:t>100, 100, 40, 0, 2 * Math.PI);</w:t>
-      </w:r>
-    </w:p>
-    <w:p>
-      <w:pPr>
-        <w:rPr>
-          <w:rFonts w:ascii="Roboto Mono" w:hAnsi="Roboto Mono"/>
-        </w:rPr>
-      </w:pPr>
-      <w:r>
-        <w:rPr>
-          <w:rFonts w:ascii="Roboto Mono" w:hAnsi="Roboto Mono"/>
-        </w:rPr>
-        <w:t xml:space="preserve">        </w:t>
-      </w:r>
-      <w:proofErr w:type="gramStart"/>
-      <w:r>
-        <w:rPr>
-          <w:rFonts w:ascii="Roboto Mono" w:hAnsi="Roboto Mono"/>
-        </w:rPr>
-        <w:t>ctx.stroke</w:t>
-      </w:r>
-      <w:proofErr w:type="gramEnd"/>
-      <w:r>
-        <w:rPr>
-          <w:rFonts w:ascii="Roboto Mono" w:hAnsi="Roboto Mono"/>
-        </w:rPr>
-        <w:t>();</w:t>
+        <w:t>        ctx.beginPath();</w:t>
+      </w:r>
+    </w:p>
+    <w:p>
+      <w:pPr>
+        <w:rPr>
+          <w:rFonts w:ascii="Roboto Mono" w:hAnsi="Roboto Mono"/>
+        </w:rPr>
+      </w:pPr>
+      <w:r>
+        <w:rPr>
+          <w:rFonts w:ascii="Roboto Mono" w:hAnsi="Roboto Mono"/>
+        </w:rPr>
+        <w:t>        ctx.arc(100, 100, 40, 0, 2 * Math.PI);</w:t>
+      </w:r>
+    </w:p>
+    <w:p>
+      <w:pPr>
+        <w:rPr>
+          <w:rFonts w:ascii="Roboto Mono" w:hAnsi="Roboto Mono"/>
+        </w:rPr>
+      </w:pPr>
+      <w:r>
+        <w:rPr>
+          <w:rFonts w:ascii="Roboto Mono" w:hAnsi="Roboto Mono"/>
+        </w:rPr>
+        <w:t>        ctx.stroke();</w:t>
       </w:r>
     </w:p>
     <w:p>
@@ -12669,21 +11988,7 @@
         <w:rPr>
           <w:rFonts w:ascii="Roboto Mono" w:hAnsi="Roboto Mono"/>
         </w:rPr>
-        <w:t xml:space="preserve">        </w:t>
-      </w:r>
-      <w:proofErr w:type="gramStart"/>
-      <w:r>
-        <w:rPr>
-          <w:rFonts w:ascii="Roboto Mono" w:hAnsi="Roboto Mono"/>
-        </w:rPr>
-        <w:t>ctx.fillText</w:t>
-      </w:r>
-      <w:proofErr w:type="gramEnd"/>
-      <w:r>
-        <w:rPr>
-          <w:rFonts w:ascii="Roboto Mono" w:hAnsi="Roboto Mono"/>
-        </w:rPr>
-        <w:t>("Hello", 20, 200);</w:t>
+        <w:t>        ctx.fillText("Hello", 20, 200);</w:t>
       </w:r>
     </w:p>
     <w:p>
@@ -12717,21 +12022,7 @@
         <w:rPr>
           <w:rFonts w:ascii="Roboto Mono" w:hAnsi="Roboto Mono"/>
         </w:rPr>
-        <w:t xml:space="preserve">        </w:t>
-      </w:r>
-      <w:proofErr w:type="gramStart"/>
-      <w:r>
-        <w:rPr>
-          <w:rFonts w:ascii="Roboto Mono" w:hAnsi="Roboto Mono"/>
-        </w:rPr>
-        <w:t>ctx.strokeText</w:t>
-      </w:r>
-      <w:proofErr w:type="gramEnd"/>
-      <w:r>
-        <w:rPr>
-          <w:rFonts w:ascii="Roboto Mono" w:hAnsi="Roboto Mono"/>
-        </w:rPr>
-        <w:t>("Canvas", 20, 250);</w:t>
+        <w:t>        ctx.strokeText("Canvas", 20, 250);</w:t>
       </w:r>
     </w:p>
     <w:p>
@@ -12764,21 +12055,7 @@
         <w:rPr>
           <w:rFonts w:ascii="Roboto Mono" w:hAnsi="Roboto Mono"/>
         </w:rPr>
-        <w:t xml:space="preserve">        let grd1 = </w:t>
-      </w:r>
-      <w:proofErr w:type="gramStart"/>
-      <w:r>
-        <w:rPr>
-          <w:rFonts w:ascii="Roboto Mono" w:hAnsi="Roboto Mono"/>
-        </w:rPr>
-        <w:t>ctx.createLinearGradient</w:t>
-      </w:r>
-      <w:proofErr w:type="gramEnd"/>
-      <w:r>
-        <w:rPr>
-          <w:rFonts w:ascii="Roboto Mono" w:hAnsi="Roboto Mono"/>
-        </w:rPr>
-        <w:t>(0, 0, 200, 0);</w:t>
+        <w:t>        let grd1 = ctx.createLinearGradient(0, 0, 200, 0);</w:t>
       </w:r>
     </w:p>
     <w:p>
@@ -12831,55 +12108,27 @@
         <w:rPr>
           <w:rFonts w:ascii="Roboto Mono" w:hAnsi="Roboto Mono"/>
         </w:rPr>
-        <w:t xml:space="preserve">        </w:t>
-      </w:r>
-      <w:proofErr w:type="gramStart"/>
-      <w:r>
-        <w:rPr>
-          <w:rFonts w:ascii="Roboto Mono" w:hAnsi="Roboto Mono"/>
-        </w:rPr>
-        <w:t>ctx.fillStyle</w:t>
-      </w:r>
-      <w:proofErr w:type="gramEnd"/>
-      <w:r>
-        <w:rPr>
-          <w:rFonts w:ascii="Roboto Mono" w:hAnsi="Roboto Mono"/>
-        </w:rPr>
-        <w:t xml:space="preserve"> = grd1;</w:t>
-      </w:r>
-    </w:p>
-    <w:p>
-      <w:pPr>
-        <w:rPr>
-          <w:rFonts w:ascii="Roboto Mono" w:hAnsi="Roboto Mono"/>
-        </w:rPr>
-      </w:pPr>
-    </w:p>
-    <w:p>
-      <w:pPr>
-        <w:rPr>
-          <w:rFonts w:ascii="Roboto Mono" w:hAnsi="Roboto Mono"/>
-        </w:rPr>
-      </w:pPr>
-      <w:r>
-        <w:rPr>
-          <w:rFonts w:ascii="Roboto Mono" w:hAnsi="Roboto Mono"/>
-        </w:rPr>
-        <w:t xml:space="preserve">        </w:t>
-      </w:r>
-      <w:proofErr w:type="gramStart"/>
-      <w:r>
-        <w:rPr>
-          <w:rFonts w:ascii="Roboto Mono" w:hAnsi="Roboto Mono"/>
-        </w:rPr>
-        <w:t>ctx.fillRect</w:t>
-      </w:r>
-      <w:proofErr w:type="gramEnd"/>
-      <w:r>
-        <w:rPr>
-          <w:rFonts w:ascii="Roboto Mono" w:hAnsi="Roboto Mono"/>
-        </w:rPr>
-        <w:t>(20, 280, 200, 50);</w:t>
+        <w:t>        ctx.fillStyle = grd1;</w:t>
+      </w:r>
+    </w:p>
+    <w:p>
+      <w:pPr>
+        <w:rPr>
+          <w:rFonts w:ascii="Roboto Mono" w:hAnsi="Roboto Mono"/>
+        </w:rPr>
+      </w:pPr>
+    </w:p>
+    <w:p>
+      <w:pPr>
+        <w:rPr>
+          <w:rFonts w:ascii="Roboto Mono" w:hAnsi="Roboto Mono"/>
+        </w:rPr>
+      </w:pPr>
+      <w:r>
+        <w:rPr>
+          <w:rFonts w:ascii="Roboto Mono" w:hAnsi="Roboto Mono"/>
+        </w:rPr>
+        <w:t>        ctx.fillRect(20, 280, 200, 50);</w:t>
       </w:r>
     </w:p>
     <w:p>
@@ -12912,21 +12161,7 @@
         <w:rPr>
           <w:rFonts w:ascii="Roboto Mono" w:hAnsi="Roboto Mono"/>
         </w:rPr>
-        <w:t xml:space="preserve">        let grd2 = </w:t>
-      </w:r>
-      <w:proofErr w:type="gramStart"/>
-      <w:r>
-        <w:rPr>
-          <w:rFonts w:ascii="Roboto Mono" w:hAnsi="Roboto Mono"/>
-        </w:rPr>
-        <w:t>ctx.createRadialGradient</w:t>
-      </w:r>
-      <w:proofErr w:type="gramEnd"/>
-      <w:r>
-        <w:rPr>
-          <w:rFonts w:ascii="Roboto Mono" w:hAnsi="Roboto Mono"/>
-        </w:rPr>
-        <w:t>(</w:t>
+        <w:t>        let grd2 = ctx.createRadialGradient(</w:t>
       </w:r>
     </w:p>
     <w:p>
@@ -13018,55 +12253,27 @@
         <w:rPr>
           <w:rFonts w:ascii="Roboto Mono" w:hAnsi="Roboto Mono"/>
         </w:rPr>
-        <w:t xml:space="preserve">        </w:t>
-      </w:r>
-      <w:proofErr w:type="gramStart"/>
-      <w:r>
-        <w:rPr>
-          <w:rFonts w:ascii="Roboto Mono" w:hAnsi="Roboto Mono"/>
-        </w:rPr>
-        <w:t>ctx.fillStyle</w:t>
-      </w:r>
-      <w:proofErr w:type="gramEnd"/>
-      <w:r>
-        <w:rPr>
-          <w:rFonts w:ascii="Roboto Mono" w:hAnsi="Roboto Mono"/>
-        </w:rPr>
-        <w:t xml:space="preserve"> = grd2;</w:t>
-      </w:r>
-    </w:p>
-    <w:p>
-      <w:pPr>
-        <w:rPr>
-          <w:rFonts w:ascii="Roboto Mono" w:hAnsi="Roboto Mono"/>
-        </w:rPr>
-      </w:pPr>
-    </w:p>
-    <w:p>
-      <w:pPr>
-        <w:rPr>
-          <w:rFonts w:ascii="Roboto Mono" w:hAnsi="Roboto Mono"/>
-        </w:rPr>
-      </w:pPr>
-      <w:r>
-        <w:rPr>
-          <w:rFonts w:ascii="Roboto Mono" w:hAnsi="Roboto Mono"/>
-        </w:rPr>
-        <w:t xml:space="preserve">        </w:t>
-      </w:r>
-      <w:proofErr w:type="gramStart"/>
-      <w:r>
-        <w:rPr>
-          <w:rFonts w:ascii="Roboto Mono" w:hAnsi="Roboto Mono"/>
-        </w:rPr>
-        <w:t>ctx.fillRect</w:t>
-      </w:r>
-      <w:proofErr w:type="gramEnd"/>
-      <w:r>
-        <w:rPr>
-          <w:rFonts w:ascii="Roboto Mono" w:hAnsi="Roboto Mono"/>
-        </w:rPr>
-        <w:t>(300, 70, 200, 150);</w:t>
+        <w:t>        ctx.fillStyle = grd2;</w:t>
+      </w:r>
+    </w:p>
+    <w:p>
+      <w:pPr>
+        <w:rPr>
+          <w:rFonts w:ascii="Roboto Mono" w:hAnsi="Roboto Mono"/>
+        </w:rPr>
+      </w:pPr>
+    </w:p>
+    <w:p>
+      <w:pPr>
+        <w:rPr>
+          <w:rFonts w:ascii="Roboto Mono" w:hAnsi="Roboto Mono"/>
+        </w:rPr>
+      </w:pPr>
+      <w:r>
+        <w:rPr>
+          <w:rFonts w:ascii="Roboto Mono" w:hAnsi="Roboto Mono"/>
+        </w:rPr>
+        <w:t>        ctx.fillRect(300, 70, 200, 150);</w:t>
       </w:r>
     </w:p>
     <w:p>
@@ -13099,89 +12306,47 @@
         <w:rPr>
           <w:rFonts w:ascii="Roboto Mono" w:hAnsi="Roboto Mono"/>
         </w:rPr>
-        <w:t xml:space="preserve">        let img = </w:t>
-      </w:r>
-      <w:proofErr w:type="gramStart"/>
-      <w:r>
-        <w:rPr>
-          <w:rFonts w:ascii="Roboto Mono" w:hAnsi="Roboto Mono"/>
-        </w:rPr>
-        <w:t>document.getElementById</w:t>
-      </w:r>
-      <w:proofErr w:type="gramEnd"/>
-      <w:r>
-        <w:rPr>
-          <w:rFonts w:ascii="Roboto Mono" w:hAnsi="Roboto Mono"/>
-        </w:rPr>
-        <w:t>("photo");</w:t>
-      </w:r>
-    </w:p>
-    <w:p>
-      <w:pPr>
-        <w:rPr>
-          <w:rFonts w:ascii="Roboto Mono" w:hAnsi="Roboto Mono"/>
-        </w:rPr>
-      </w:pPr>
-    </w:p>
-    <w:p>
-      <w:pPr>
-        <w:rPr>
-          <w:rFonts w:ascii="Roboto Mono" w:hAnsi="Roboto Mono"/>
-        </w:rPr>
-      </w:pPr>
-      <w:r>
-        <w:rPr>
-          <w:rFonts w:ascii="Roboto Mono" w:hAnsi="Roboto Mono"/>
-        </w:rPr>
-        <w:t xml:space="preserve">        </w:t>
-      </w:r>
-      <w:proofErr w:type="gramStart"/>
-      <w:r>
-        <w:rPr>
-          <w:rFonts w:ascii="Roboto Mono" w:hAnsi="Roboto Mono"/>
-        </w:rPr>
-        <w:t>img.onload</w:t>
-      </w:r>
-      <w:proofErr w:type="gramEnd"/>
-      <w:r>
-        <w:rPr>
-          <w:rFonts w:ascii="Roboto Mono" w:hAnsi="Roboto Mono"/>
-        </w:rPr>
-        <w:t xml:space="preserve"> = function () {</w:t>
-      </w:r>
-    </w:p>
-    <w:p>
-      <w:pPr>
-        <w:rPr>
-          <w:rFonts w:ascii="Roboto Mono" w:hAnsi="Roboto Mono"/>
-        </w:rPr>
-      </w:pPr>
-    </w:p>
-    <w:p>
-      <w:pPr>
-        <w:rPr>
-          <w:rFonts w:ascii="Roboto Mono" w:hAnsi="Roboto Mono"/>
-        </w:rPr>
-      </w:pPr>
-      <w:r>
-        <w:rPr>
-          <w:rFonts w:ascii="Roboto Mono" w:hAnsi="Roboto Mono"/>
-        </w:rPr>
-        <w:t xml:space="preserve">            </w:t>
-      </w:r>
-      <w:proofErr w:type="gramStart"/>
-      <w:r>
-        <w:rPr>
-          <w:rFonts w:ascii="Roboto Mono" w:hAnsi="Roboto Mono"/>
-        </w:rPr>
-        <w:t>ctx.drawImage</w:t>
-      </w:r>
-      <w:proofErr w:type="gramEnd"/>
-      <w:r>
-        <w:rPr>
-          <w:rFonts w:ascii="Roboto Mono" w:hAnsi="Roboto Mono"/>
-        </w:rPr>
-        <w:t>(img, 300, 300, 200, 150);</w:t>
+        <w:t>        let img = document.getElementById("photo");</w:t>
+      </w:r>
+    </w:p>
+    <w:p>
+      <w:pPr>
+        <w:rPr>
+          <w:rFonts w:ascii="Roboto Mono" w:hAnsi="Roboto Mono"/>
+        </w:rPr>
+      </w:pPr>
+    </w:p>
+    <w:p>
+      <w:pPr>
+        <w:rPr>
+          <w:rFonts w:ascii="Roboto Mono" w:hAnsi="Roboto Mono"/>
+        </w:rPr>
+      </w:pPr>
+      <w:r>
+        <w:rPr>
+          <w:rFonts w:ascii="Roboto Mono" w:hAnsi="Roboto Mono"/>
+        </w:rPr>
+        <w:t>        img.onload = function () {</w:t>
+      </w:r>
+    </w:p>
+    <w:p>
+      <w:pPr>
+        <w:rPr>
+          <w:rFonts w:ascii="Roboto Mono" w:hAnsi="Roboto Mono"/>
+        </w:rPr>
+      </w:pPr>
+    </w:p>
+    <w:p>
+      <w:pPr>
+        <w:rPr>
+          <w:rFonts w:ascii="Roboto Mono" w:hAnsi="Roboto Mono"/>
+        </w:rPr>
+      </w:pPr>
+      <w:r>
+        <w:rPr>
+          <w:rFonts w:ascii="Roboto Mono" w:hAnsi="Roboto Mono"/>
+        </w:rPr>
+        <w:t>            ctx.drawImage(img, 300, 300, 200, 150);</w:t>
       </w:r>
     </w:p>
     <w:p>
@@ -13275,7 +12440,7 @@
           <w:noProof/>
         </w:rPr>
         <w:drawing>
-          <wp:inline distT="0" distB="0" distL="0" distR="0" wp14:anchorId="0238EF9C" wp14:editId="068614C7">
+          <wp:inline distT="0" distB="0" distL="0" distR="0" wp14:anchorId="0238EF9C" wp14:editId="4115ADF3">
             <wp:extent cx="5943600" cy="3178175"/>
             <wp:effectExtent l="0" t="0" r="0" b="3175"/>
             <wp:docPr id="540194930" name="Picture 21"/>
@@ -13762,19 +12927,11 @@
                 <w:rFonts w:ascii="Roboto Mono" w:hAnsi="Roboto Mono"/>
               </w:rPr>
             </w:pPr>
-            <w:proofErr w:type="gramStart"/>
             <w:r>
               <w:rPr>
                 <w:rFonts w:ascii="Roboto Mono" w:hAnsi="Roboto Mono"/>
               </w:rPr>
-              <w:t>lineTo(</w:t>
-            </w:r>
-            <w:proofErr w:type="gramEnd"/>
-            <w:r>
-              <w:rPr>
-                <w:rFonts w:ascii="Roboto Mono" w:hAnsi="Roboto Mono"/>
-              </w:rPr>
-              <w:t>)</w:t>
+              <w:t>lineTo()</w:t>
             </w:r>
           </w:p>
         </w:tc>
@@ -13815,19 +12972,11 @@
                 <w:rFonts w:ascii="Roboto Mono" w:hAnsi="Roboto Mono"/>
               </w:rPr>
             </w:pPr>
-            <w:proofErr w:type="gramStart"/>
             <w:r>
               <w:rPr>
                 <w:rFonts w:ascii="Roboto Mono" w:hAnsi="Roboto Mono"/>
               </w:rPr>
-              <w:t>arc(</w:t>
-            </w:r>
-            <w:proofErr w:type="gramEnd"/>
-            <w:r>
-              <w:rPr>
-                <w:rFonts w:ascii="Roboto Mono" w:hAnsi="Roboto Mono"/>
-              </w:rPr>
-              <w:t>)</w:t>
+              <w:t>arc()</w:t>
             </w:r>
           </w:p>
         </w:tc>
@@ -13868,19 +13017,11 @@
                 <w:rFonts w:ascii="Roboto Mono" w:hAnsi="Roboto Mono"/>
               </w:rPr>
             </w:pPr>
-            <w:proofErr w:type="gramStart"/>
             <w:r>
               <w:rPr>
                 <w:rFonts w:ascii="Roboto Mono" w:hAnsi="Roboto Mono"/>
               </w:rPr>
-              <w:t>fillText(</w:t>
-            </w:r>
-            <w:proofErr w:type="gramEnd"/>
-            <w:r>
-              <w:rPr>
-                <w:rFonts w:ascii="Roboto Mono" w:hAnsi="Roboto Mono"/>
-              </w:rPr>
-              <w:t>)</w:t>
+              <w:t>fillText()</w:t>
             </w:r>
           </w:p>
         </w:tc>
@@ -13921,19 +13062,11 @@
                 <w:rFonts w:ascii="Roboto Mono" w:hAnsi="Roboto Mono"/>
               </w:rPr>
             </w:pPr>
-            <w:proofErr w:type="gramStart"/>
             <w:r>
               <w:rPr>
                 <w:rFonts w:ascii="Roboto Mono" w:hAnsi="Roboto Mono"/>
               </w:rPr>
-              <w:t>strokeText(</w:t>
-            </w:r>
-            <w:proofErr w:type="gramEnd"/>
-            <w:r>
-              <w:rPr>
-                <w:rFonts w:ascii="Roboto Mono" w:hAnsi="Roboto Mono"/>
-              </w:rPr>
-              <w:t>)</w:t>
+              <w:t>strokeText()</w:t>
             </w:r>
           </w:p>
         </w:tc>
@@ -13974,19 +13107,11 @@
                 <w:rFonts w:ascii="Roboto Mono" w:hAnsi="Roboto Mono"/>
               </w:rPr>
             </w:pPr>
-            <w:proofErr w:type="gramStart"/>
             <w:r>
               <w:rPr>
                 <w:rFonts w:ascii="Roboto Mono" w:hAnsi="Roboto Mono"/>
               </w:rPr>
-              <w:t>createLinearGradient(</w:t>
-            </w:r>
-            <w:proofErr w:type="gramEnd"/>
-            <w:r>
-              <w:rPr>
-                <w:rFonts w:ascii="Roboto Mono" w:hAnsi="Roboto Mono"/>
-              </w:rPr>
-              <w:t>)</w:t>
+              <w:t>createLinearGradient()</w:t>
             </w:r>
           </w:p>
         </w:tc>
@@ -14027,19 +13152,11 @@
                 <w:rFonts w:ascii="Roboto Mono" w:hAnsi="Roboto Mono"/>
               </w:rPr>
             </w:pPr>
-            <w:proofErr w:type="gramStart"/>
             <w:r>
               <w:rPr>
                 <w:rFonts w:ascii="Roboto Mono" w:hAnsi="Roboto Mono"/>
               </w:rPr>
-              <w:t>createRadialGradient(</w:t>
-            </w:r>
-            <w:proofErr w:type="gramEnd"/>
-            <w:r>
-              <w:rPr>
-                <w:rFonts w:ascii="Roboto Mono" w:hAnsi="Roboto Mono"/>
-              </w:rPr>
-              <w:t>)</w:t>
+              <w:t>createRadialGradient()</w:t>
             </w:r>
           </w:p>
         </w:tc>
@@ -14080,19 +13197,11 @@
                 <w:rFonts w:ascii="Roboto Mono" w:hAnsi="Roboto Mono"/>
               </w:rPr>
             </w:pPr>
-            <w:proofErr w:type="gramStart"/>
             <w:r>
               <w:rPr>
                 <w:rFonts w:ascii="Roboto Mono" w:hAnsi="Roboto Mono"/>
               </w:rPr>
-              <w:t>drawImage(</w:t>
-            </w:r>
-            <w:proofErr w:type="gramEnd"/>
-            <w:r>
-              <w:rPr>
-                <w:rFonts w:ascii="Roboto Mono" w:hAnsi="Roboto Mono"/>
-              </w:rPr>
-              <w:t>)</w:t>
+              <w:t>drawImage()</w:t>
             </w:r>
           </w:p>
         </w:tc>
@@ -14283,15 +13392,7 @@
         <w:t>✅</w:t>
       </w:r>
       <w:r>
-        <w:t xml:space="preserve"> Use </w:t>
-      </w:r>
-      <w:proofErr w:type="gramStart"/>
-      <w:r>
-        <w:t>beginPath(</w:t>
-      </w:r>
-      <w:proofErr w:type="gramEnd"/>
-      <w:r>
-        <w:t>) for new shapes</w:t>
+        <w:t xml:space="preserve"> Use beginPath() for new shapes</w:t>
       </w:r>
     </w:p>
     <w:p>
@@ -19582,21 +18683,7 @@
         <w:rPr>
           <w:rFonts w:ascii="Roboto Mono" w:hAnsi="Roboto Mono"/>
         </w:rPr>
-        <w:t xml:space="preserve">    </w:t>
-      </w:r>
-      <w:proofErr w:type="gramStart"/>
-      <w:r>
-        <w:rPr>
-          <w:rFonts w:ascii="Roboto Mono" w:hAnsi="Roboto Mono"/>
-        </w:rPr>
-        <w:t>&lt;!--</w:t>
-      </w:r>
-      <w:proofErr w:type="gramEnd"/>
-      <w:r>
-        <w:rPr>
-          <w:rFonts w:ascii="Roboto Mono" w:hAnsi="Roboto Mono"/>
-        </w:rPr>
-        <w:t xml:space="preserve"> Circle --&gt;</w:t>
+        <w:t xml:space="preserve">    &lt;!-- Circle --&gt;</w:t>
       </w:r>
     </w:p>
     <w:p>
@@ -19754,21 +18841,7 @@
         <w:rPr>
           <w:rFonts w:ascii="Roboto Mono" w:hAnsi="Roboto Mono"/>
         </w:rPr>
-        <w:t xml:space="preserve">    </w:t>
-      </w:r>
-      <w:proofErr w:type="gramStart"/>
-      <w:r>
-        <w:rPr>
-          <w:rFonts w:ascii="Roboto Mono" w:hAnsi="Roboto Mono"/>
-        </w:rPr>
-        <w:t>&lt;!--</w:t>
-      </w:r>
-      <w:proofErr w:type="gramEnd"/>
-      <w:r>
-        <w:rPr>
-          <w:rFonts w:ascii="Roboto Mono" w:hAnsi="Roboto Mono"/>
-        </w:rPr>
-        <w:t xml:space="preserve"> Rectangle --&gt;</w:t>
+        <w:t xml:space="preserve">    &lt;!-- Rectangle --&gt;</w:t>
       </w:r>
     </w:p>
     <w:p>
@@ -19914,21 +18987,7 @@
         <w:rPr>
           <w:rFonts w:ascii="Roboto Mono" w:hAnsi="Roboto Mono"/>
         </w:rPr>
-        <w:t xml:space="preserve">    </w:t>
-      </w:r>
-      <w:proofErr w:type="gramStart"/>
-      <w:r>
-        <w:rPr>
-          <w:rFonts w:ascii="Roboto Mono" w:hAnsi="Roboto Mono"/>
-        </w:rPr>
-        <w:t>&lt;!--</w:t>
-      </w:r>
-      <w:proofErr w:type="gramEnd"/>
-      <w:r>
-        <w:rPr>
-          <w:rFonts w:ascii="Roboto Mono" w:hAnsi="Roboto Mono"/>
-        </w:rPr>
-        <w:t xml:space="preserve"> Rounded Rectangle --&gt;</w:t>
+        <w:t xml:space="preserve">    &lt;!-- Rounded Rectangle --&gt;</w:t>
       </w:r>
     </w:p>
     <w:p>
@@ -20112,21 +19171,7 @@
         <w:rPr>
           <w:rFonts w:ascii="Roboto Mono" w:hAnsi="Roboto Mono"/>
         </w:rPr>
-        <w:t xml:space="preserve">    </w:t>
-      </w:r>
-      <w:proofErr w:type="gramStart"/>
-      <w:r>
-        <w:rPr>
-          <w:rFonts w:ascii="Roboto Mono" w:hAnsi="Roboto Mono"/>
-        </w:rPr>
-        <w:t>&lt;!--</w:t>
-      </w:r>
-      <w:proofErr w:type="gramEnd"/>
-      <w:r>
-        <w:rPr>
-          <w:rFonts w:ascii="Roboto Mono" w:hAnsi="Roboto Mono"/>
-        </w:rPr>
-        <w:t xml:space="preserve"> Star --&gt;</w:t>
+        <w:t xml:space="preserve">    &lt;!-- Star --&gt;</w:t>
       </w:r>
     </w:p>
     <w:p>
@@ -20388,21 +19433,7 @@
         <w:rPr>
           <w:rFonts w:ascii="Roboto Mono" w:hAnsi="Roboto Mono"/>
         </w:rPr>
-        <w:t xml:space="preserve">    </w:t>
-      </w:r>
-      <w:proofErr w:type="gramStart"/>
-      <w:r>
-        <w:rPr>
-          <w:rFonts w:ascii="Roboto Mono" w:hAnsi="Roboto Mono"/>
-        </w:rPr>
-        <w:t>&lt;!--</w:t>
-      </w:r>
-      <w:proofErr w:type="gramEnd"/>
-      <w:r>
-        <w:rPr>
-          <w:rFonts w:ascii="Roboto Mono" w:hAnsi="Roboto Mono"/>
-        </w:rPr>
-        <w:t xml:space="preserve"> Gradient Ellipse --&gt;</w:t>
+        <w:t xml:space="preserve">    &lt;!-- Gradient Ellipse --&gt;</w:t>
       </w:r>
     </w:p>
     <w:p>
@@ -20874,13 +19905,91 @@
           <w:rFonts w:ascii="Roboto Mono" w:hAnsi="Roboto Mono"/>
         </w:rPr>
       </w:pPr>
-      <w:r>
-        <w:rPr>
-          <w:rFonts w:ascii="Arial" w:hAnsi="Arial"/>
-          <w:b/>
-          <w:sz w:val="18"/>
-          <w:highlight w:val="lightGray"/>
-        </w:rPr>
+    </w:p>
+    <w:p>
+      <w:pPr>
+        <w:rPr>
+          <w:rFonts w:ascii="Roboto Mono" w:hAnsi="Roboto Mono"/>
+        </w:rPr>
+      </w:pPr>
+    </w:p>
+    <w:p>
+      <w:pPr>
+        <w:rPr>
+          <w:rFonts w:ascii="Roboto Mono" w:hAnsi="Roboto Mono"/>
+        </w:rPr>
+      </w:pPr>
+    </w:p>
+    <w:p>
+      <w:pPr>
+        <w:rPr>
+          <w:rFonts w:ascii="Roboto Mono" w:hAnsi="Roboto Mono"/>
+        </w:rPr>
+      </w:pPr>
+    </w:p>
+    <w:p>
+      <w:pPr>
+        <w:rPr>
+          <w:rFonts w:ascii="Roboto Mono" w:hAnsi="Roboto Mono"/>
+        </w:rPr>
+      </w:pPr>
+    </w:p>
+    <w:p>
+      <w:pPr>
+        <w:rPr>
+          <w:rFonts w:ascii="Roboto Mono" w:hAnsi="Roboto Mono"/>
+        </w:rPr>
+      </w:pPr>
+    </w:p>
+    <w:p>
+      <w:pPr>
+        <w:rPr>
+          <w:rFonts w:ascii="Roboto Mono" w:hAnsi="Roboto Mono"/>
+        </w:rPr>
+      </w:pPr>
+    </w:p>
+    <w:p>
+      <w:pPr>
+        <w:rPr>
+          <w:rFonts w:ascii="Roboto Mono" w:hAnsi="Roboto Mono"/>
+        </w:rPr>
+      </w:pPr>
+    </w:p>
+    <w:p>
+      <w:pPr>
+        <w:rPr>
+          <w:rFonts w:ascii="Roboto Mono" w:hAnsi="Roboto Mono"/>
+        </w:rPr>
+      </w:pPr>
+    </w:p>
+    <w:p>
+      <w:pPr>
+        <w:rPr>
+          <w:rFonts w:ascii="Roboto Mono" w:hAnsi="Roboto Mono"/>
+        </w:rPr>
+      </w:pPr>
+    </w:p>
+    <w:p>
+      <w:pPr>
+        <w:rPr>
+          <w:rFonts w:ascii="Roboto Mono" w:hAnsi="Roboto Mono"/>
+        </w:rPr>
+      </w:pPr>
+    </w:p>
+    <w:p>
+      <w:pPr>
+        <w:rPr>
+          <w:rFonts w:ascii="Roboto Mono" w:hAnsi="Roboto Mono"/>
+        </w:rPr>
+      </w:pPr>
+      <w:r>
+        <w:rPr>
+          <w:rFonts w:ascii="Arial" w:hAnsi="Arial"/>
+          <w:b/>
+          <w:sz w:val="18"/>
+          <w:highlight w:val="lightGray"/>
+        </w:rPr>
+        <w:lastRenderedPageBreak/>
         <w:t># Source: GIF</w:t>
       </w:r>
       <w:r>
@@ -20997,7 +20106,6 @@
         <w:rPr>
           <w:noProof/>
         </w:rPr>
-        <w:lastRenderedPageBreak/>
         <w:drawing>
           <wp:inline distT="0" distB="0" distL="0" distR="0" wp14:anchorId="7C3EB394" wp14:editId="520E746C">
             <wp:extent cx="5943600" cy="3343275"/>
@@ -21228,7 +20336,7 @@
           <w:noProof/>
         </w:rPr>
         <w:drawing>
-          <wp:inline distT="0" distB="0" distL="0" distR="0" wp14:anchorId="2C5A9342" wp14:editId="2614C995">
+          <wp:inline distT="0" distB="0" distL="0" distR="0" wp14:anchorId="2C5A9342" wp14:editId="723046B6">
             <wp:extent cx="5943600" cy="3343275"/>
             <wp:effectExtent l="0" t="0" r="0" b="9525"/>
             <wp:docPr id="2135797907" name="Picture 39"/>
@@ -26029,6 +25137,7 @@
   <w:style w:type="character" w:default="1" w:styleId="DefaultParagraphFont">
     <w:name w:val="Default Paragraph Font"/>
     <w:uiPriority w:val="1"/>
+    <w:semiHidden/>
     <w:unhideWhenUsed/>
   </w:style>
   <w:style w:type="table" w:default="1" w:styleId="TableNormal">

</xml_diff>